<commit_message>
Updated diagrams and projectreport files
</commit_message>
<xml_diff>
--- a/ProjectReport.docx
+++ b/ProjectReport.docx
@@ -720,6 +720,232 @@
         <w:t>Before final upload, replace all bracketed identity fields, add the actual repository URL, compile and test on the college computer, capture genuine screenshots, render diagram images if required, and verify the institution's submission checklist.</w:t>
       </w:r>
     </w:p>
+    <w:p>
+      <w:pPr>
+        <w:pageBreakBefore/>
+        <w:jc w:val="center"/>
+      </w:pPr>
+      <w:r>
+        <w:rPr>
+          <w:rFonts w:ascii="Times New Roman" w:hAnsi="Times New Roman"/>
+          <w:b/>
+          <w:sz w:val="32"/>
+        </w:rPr>
+        <w:t>UML DIAGRAMS</w:t>
+      </w:r>
+    </w:p>
+    <w:p>
+      <w:pPr>
+        <w:pageBreakBefore/>
+        <w:jc w:val="center"/>
+      </w:pPr>
+      <w:r>
+        <w:rPr>
+          <w:rFonts w:ascii="Times New Roman" w:hAnsi="Times New Roman"/>
+          <w:b/>
+          <w:sz w:val="26"/>
+        </w:rPr>
+        <w:t>Use Case Diagram</w:t>
+      </w:r>
+    </w:p>
+    <w:p>
+      <w:pPr>
+        <w:jc w:val="center"/>
+      </w:pPr>
+      <w:r>
+        <w:drawing>
+          <wp:inline xmlns:a="http://schemas.openxmlformats.org/drawingml/2006/main" xmlns:pic="http://schemas.openxmlformats.org/drawingml/2006/picture">
+            <wp:extent cx="5852160" cy="4064000"/>
+            <wp:docPr id="1" name="Picture 1"/>
+            <wp:cNvGraphicFramePr>
+              <a:graphicFrameLocks noChangeAspect="1"/>
+            </wp:cNvGraphicFramePr>
+            <a:graphic>
+              <a:graphicData uri="http://schemas.openxmlformats.org/drawingml/2006/picture">
+                <pic:pic>
+                  <pic:nvPicPr>
+                    <pic:cNvPr id="0" name="use_case_diagram.png"/>
+                    <pic:cNvPicPr/>
+                  </pic:nvPicPr>
+                  <pic:blipFill>
+                    <a:blip r:embed="rId13"/>
+                    <a:stretch>
+                      <a:fillRect/>
+                    </a:stretch>
+                  </pic:blipFill>
+                  <pic:spPr>
+                    <a:xfrm>
+                      <a:off x="0" y="0"/>
+                      <a:ext cx="5852160" cy="4064000"/>
+                    </a:xfrm>
+                    <a:prstGeom prst="rect"/>
+                  </pic:spPr>
+                </pic:pic>
+              </a:graphicData>
+            </a:graphic>
+          </wp:inline>
+        </w:drawing>
+      </w:r>
+    </w:p>
+    <w:p>
+      <w:pPr>
+        <w:pageBreakBefore/>
+        <w:jc w:val="center"/>
+      </w:pPr>
+      <w:r>
+        <w:rPr>
+          <w:rFonts w:ascii="Times New Roman" w:hAnsi="Times New Roman"/>
+          <w:b/>
+          <w:sz w:val="26"/>
+        </w:rPr>
+        <w:t>Class Diagram</w:t>
+      </w:r>
+    </w:p>
+    <w:p>
+      <w:pPr>
+        <w:jc w:val="center"/>
+      </w:pPr>
+      <w:r>
+        <w:drawing>
+          <wp:inline xmlns:a="http://schemas.openxmlformats.org/drawingml/2006/main" xmlns:pic="http://schemas.openxmlformats.org/drawingml/2006/picture">
+            <wp:extent cx="5852160" cy="4064000"/>
+            <wp:docPr id="2" name="Picture 2"/>
+            <wp:cNvGraphicFramePr>
+              <a:graphicFrameLocks noChangeAspect="1"/>
+            </wp:cNvGraphicFramePr>
+            <a:graphic>
+              <a:graphicData uri="http://schemas.openxmlformats.org/drawingml/2006/picture">
+                <pic:pic>
+                  <pic:nvPicPr>
+                    <pic:cNvPr id="0" name="class_diagram.png"/>
+                    <pic:cNvPicPr/>
+                  </pic:nvPicPr>
+                  <pic:blipFill>
+                    <a:blip r:embed="rId14"/>
+                    <a:stretch>
+                      <a:fillRect/>
+                    </a:stretch>
+                  </pic:blipFill>
+                  <pic:spPr>
+                    <a:xfrm>
+                      <a:off x="0" y="0"/>
+                      <a:ext cx="5852160" cy="4064000"/>
+                    </a:xfrm>
+                    <a:prstGeom prst="rect"/>
+                  </pic:spPr>
+                </pic:pic>
+              </a:graphicData>
+            </a:graphic>
+          </wp:inline>
+        </w:drawing>
+      </w:r>
+    </w:p>
+    <w:p>
+      <w:pPr>
+        <w:pageBreakBefore/>
+        <w:jc w:val="center"/>
+      </w:pPr>
+      <w:r>
+        <w:rPr>
+          <w:rFonts w:ascii="Times New Roman" w:hAnsi="Times New Roman"/>
+          <w:b/>
+          <w:sz w:val="26"/>
+        </w:rPr>
+        <w:t>Sequence Diagram 1 — Main Transaction: Register Participant</w:t>
+      </w:r>
+    </w:p>
+    <w:p>
+      <w:pPr>
+        <w:jc w:val="center"/>
+      </w:pPr>
+      <w:r>
+        <w:drawing>
+          <wp:inline xmlns:a="http://schemas.openxmlformats.org/drawingml/2006/main" xmlns:pic="http://schemas.openxmlformats.org/drawingml/2006/picture">
+            <wp:extent cx="5852160" cy="4389120"/>
+            <wp:docPr id="3" name="Picture 3"/>
+            <wp:cNvGraphicFramePr>
+              <a:graphicFrameLocks noChangeAspect="1"/>
+            </wp:cNvGraphicFramePr>
+            <a:graphic>
+              <a:graphicData uri="http://schemas.openxmlformats.org/drawingml/2006/picture">
+                <pic:pic>
+                  <pic:nvPicPr>
+                    <pic:cNvPr id="0" name="sequence_registration.png"/>
+                    <pic:cNvPicPr/>
+                  </pic:nvPicPr>
+                  <pic:blipFill>
+                    <a:blip r:embed="rId15"/>
+                    <a:stretch>
+                      <a:fillRect/>
+                    </a:stretch>
+                  </pic:blipFill>
+                  <pic:spPr>
+                    <a:xfrm>
+                      <a:off x="0" y="0"/>
+                      <a:ext cx="5852160" cy="4389120"/>
+                    </a:xfrm>
+                    <a:prstGeom prst="rect"/>
+                  </pic:spPr>
+                </pic:pic>
+              </a:graphicData>
+            </a:graphic>
+          </wp:inline>
+        </w:drawing>
+      </w:r>
+    </w:p>
+    <w:p>
+      <w:pPr>
+        <w:pageBreakBefore/>
+        <w:jc w:val="center"/>
+      </w:pPr>
+      <w:r>
+        <w:rPr>
+          <w:rFonts w:ascii="Times New Roman" w:hAnsi="Times New Roman"/>
+          <w:b/>
+          <w:sz w:val="26"/>
+        </w:rPr>
+        <w:t>Sequence Diagram 2 — Cancel Registration</w:t>
+      </w:r>
+    </w:p>
+    <w:p>
+      <w:pPr>
+        <w:jc w:val="center"/>
+      </w:pPr>
+      <w:r>
+        <w:drawing>
+          <wp:inline xmlns:a="http://schemas.openxmlformats.org/drawingml/2006/main" xmlns:pic="http://schemas.openxmlformats.org/drawingml/2006/picture">
+            <wp:extent cx="5852160" cy="4389120"/>
+            <wp:docPr id="4" name="Picture 4"/>
+            <wp:cNvGraphicFramePr>
+              <a:graphicFrameLocks noChangeAspect="1"/>
+            </wp:cNvGraphicFramePr>
+            <a:graphic>
+              <a:graphicData uri="http://schemas.openxmlformats.org/drawingml/2006/picture">
+                <pic:pic>
+                  <pic:nvPicPr>
+                    <pic:cNvPr id="0" name="sequence_cancellation.png"/>
+                    <pic:cNvPicPr/>
+                  </pic:nvPicPr>
+                  <pic:blipFill>
+                    <a:blip r:embed="rId16"/>
+                    <a:stretch>
+                      <a:fillRect/>
+                    </a:stretch>
+                  </pic:blipFill>
+                  <pic:spPr>
+                    <a:xfrm>
+                      <a:off x="0" y="0"/>
+                      <a:ext cx="5852160" cy="4389120"/>
+                    </a:xfrm>
+                    <a:prstGeom prst="rect"/>
+                  </pic:spPr>
+                </pic:pic>
+              </a:graphicData>
+            </a:graphic>
+          </wp:inline>
+        </w:drawing>
+      </w:r>
+    </w:p>
     <w:sectPr>
       <w:pgSz w:w="12240" w:h="15840"/>
       <w:pgMar w:top="1152" w:right="1296" w:bottom="1152" w:left="1296" w:header="720" w:footer="720" w:gutter="0"/>

</xml_diff>